<commit_message>
comienzo de la documentacion modificado y MVP subido
</commit_message>
<xml_diff>
--- a/doc/Documentación inicial.docx
+++ b/doc/Documentación inicial.docx
@@ -38,7 +38,7 @@
                     </pic:cNvPicPr>
                   </pic:nvPicPr>
                   <pic:blipFill>
-                    <a:blip r:embed="rId5">
+                    <a:blip r:embed="rId6">
                       <a:extLst>
                         <a:ext uri="{28A0092B-C50C-407E-A947-70E740481C1C}">
                           <a14:useLocalDpi xmlns:a14="http://schemas.microsoft.com/office/drawing/2010/main" val="0"/>
@@ -1008,12 +1008,12 @@
     <w:tbl>
       <w:tblPr>
         <w:tblStyle w:val="Tablaconcuadrcula"/>
-        <w:tblW w:w="0" w:type="auto"/>
+        <w:tblW w:w="9634" w:type="dxa"/>
         <w:tblLook w:val="04A0" w:firstRow="1" w:lastRow="0" w:firstColumn="1" w:lastColumn="0" w:noHBand="0" w:noVBand="1"/>
       </w:tblPr>
       <w:tblGrid>
         <w:gridCol w:w="2831"/>
-        <w:gridCol w:w="2831"/>
+        <w:gridCol w:w="6803"/>
       </w:tblGrid>
       <w:tr>
         <w:tc>
@@ -1025,16 +1025,16 @@
               <w:rPr>
                 <w:rFonts w:ascii="Poppins" w:hAnsi="Poppins" w:cs="Poppins"/>
                 <w:noProof/>
-                <w:sz w:val="20"/>
-                <w:szCs w:val="20"/>
+                <w:sz w:val="18"/>
+                <w:szCs w:val="18"/>
               </w:rPr>
             </w:pPr>
             <w:r>
               <w:rPr>
                 <w:rFonts w:ascii="Poppins" w:hAnsi="Poppins" w:cs="Poppins"/>
                 <w:noProof/>
-                <w:sz w:val="20"/>
-                <w:szCs w:val="20"/>
+                <w:sz w:val="18"/>
+                <w:szCs w:val="18"/>
               </w:rPr>
               <w:t>Integrante</w:t>
             </w:r>
@@ -1042,23 +1042,23 @@
         </w:tc>
         <w:tc>
           <w:tcPr>
-            <w:tcW w:w="2831" w:type="dxa"/>
+            <w:tcW w:w="6803" w:type="dxa"/>
           </w:tcPr>
           <w:p>
             <w:pPr>
               <w:rPr>
                 <w:rFonts w:ascii="Poppins" w:hAnsi="Poppins" w:cs="Poppins"/>
                 <w:noProof/>
-                <w:sz w:val="20"/>
-                <w:szCs w:val="20"/>
+                <w:sz w:val="18"/>
+                <w:szCs w:val="18"/>
               </w:rPr>
             </w:pPr>
             <w:r>
               <w:rPr>
                 <w:rFonts w:ascii="Poppins" w:hAnsi="Poppins" w:cs="Poppins"/>
                 <w:noProof/>
-                <w:sz w:val="20"/>
-                <w:szCs w:val="20"/>
+                <w:sz w:val="18"/>
+                <w:szCs w:val="18"/>
               </w:rPr>
               <w:t>Rol</w:t>
             </w:r>
@@ -1075,16 +1075,16 @@
               <w:rPr>
                 <w:rFonts w:ascii="Poppins" w:hAnsi="Poppins" w:cs="Poppins"/>
                 <w:noProof/>
-                <w:sz w:val="20"/>
-                <w:szCs w:val="20"/>
+                <w:sz w:val="18"/>
+                <w:szCs w:val="18"/>
               </w:rPr>
             </w:pPr>
             <w:r>
               <w:rPr>
                 <w:rFonts w:ascii="Poppins" w:hAnsi="Poppins" w:cs="Poppins"/>
                 <w:noProof/>
-                <w:sz w:val="20"/>
-                <w:szCs w:val="20"/>
+                <w:sz w:val="18"/>
+                <w:szCs w:val="18"/>
               </w:rPr>
               <w:t>Silva Sofia</w:t>
             </w:r>
@@ -1092,34 +1092,25 @@
         </w:tc>
         <w:tc>
           <w:tcPr>
-            <w:tcW w:w="2831" w:type="dxa"/>
+            <w:tcW w:w="6803" w:type="dxa"/>
           </w:tcPr>
           <w:p>
             <w:pPr>
               <w:rPr>
                 <w:rFonts w:ascii="Poppins" w:hAnsi="Poppins" w:cs="Poppins"/>
                 <w:noProof/>
-                <w:sz w:val="20"/>
-                <w:szCs w:val="20"/>
+                <w:sz w:val="18"/>
+                <w:szCs w:val="18"/>
               </w:rPr>
             </w:pPr>
             <w:r>
               <w:rPr>
                 <w:rFonts w:ascii="Poppins" w:hAnsi="Poppins" w:cs="Poppins"/>
                 <w:noProof/>
-                <w:sz w:val="20"/>
-                <w:szCs w:val="20"/>
-              </w:rPr>
-              <w:t xml:space="preserve">- </w:t>
-            </w:r>
-            <w:r>
-              <w:rPr>
-                <w:rFonts w:ascii="Poppins" w:hAnsi="Poppins" w:cs="Poppins"/>
-                <w:noProof/>
-                <w:sz w:val="20"/>
-                <w:szCs w:val="20"/>
-              </w:rPr>
-              <w:t>Project Manager</w:t>
+                <w:sz w:val="18"/>
+                <w:szCs w:val="18"/>
+              </w:rPr>
+              <w:t>- Project Manager</w:t>
             </w:r>
           </w:p>
           <w:p>
@@ -1127,40 +1118,74 @@
               <w:rPr>
                 <w:rFonts w:ascii="Poppins" w:hAnsi="Poppins" w:cs="Poppins"/>
                 <w:noProof/>
-                <w:sz w:val="20"/>
-                <w:szCs w:val="20"/>
+                <w:sz w:val="18"/>
+                <w:szCs w:val="18"/>
               </w:rPr>
             </w:pPr>
             <w:r>
               <w:rPr>
                 <w:rFonts w:ascii="Poppins" w:hAnsi="Poppins" w:cs="Poppins"/>
                 <w:noProof/>
-                <w:sz w:val="20"/>
-                <w:szCs w:val="20"/>
+                <w:sz w:val="18"/>
+                <w:szCs w:val="18"/>
+              </w:rPr>
+              <w:t>- Desarrolladora Backend y Fronted</w:t>
+            </w:r>
+          </w:p>
+          <w:p>
+            <w:pPr>
+              <w:rPr>
+                <w:rFonts w:ascii="Poppins" w:hAnsi="Poppins" w:cs="Poppins"/>
+                <w:noProof/>
+                <w:sz w:val="18"/>
+                <w:szCs w:val="18"/>
+              </w:rPr>
+            </w:pPr>
+            <w:r>
+              <w:rPr>
+                <w:rFonts w:ascii="Poppins" w:hAnsi="Poppins" w:cs="Poppins"/>
+                <w:noProof/>
+                <w:sz w:val="18"/>
+                <w:szCs w:val="18"/>
               </w:rPr>
               <w:t xml:space="preserve">- </w:t>
             </w:r>
             <w:r>
               <w:rPr>
                 <w:rFonts w:ascii="Poppins" w:hAnsi="Poppins" w:cs="Poppins"/>
-                <w:b/>
-                <w:bCs/>
-                <w:noProof/>
-                <w:sz w:val="20"/>
-                <w:szCs w:val="20"/>
-              </w:rPr>
-              <w:t>Desarrollador/a Backend</w:t>
+                <w:noProof/>
+                <w:sz w:val="18"/>
+                <w:szCs w:val="18"/>
+              </w:rPr>
+              <w:t>Diseñador/a de Branding y Comunicación Visual</w:t>
+            </w:r>
+          </w:p>
+          <w:p>
+            <w:pPr>
+              <w:rPr>
+                <w:rFonts w:ascii="Poppins" w:hAnsi="Poppins" w:cs="Poppins"/>
+                <w:noProof/>
+                <w:sz w:val="18"/>
+                <w:szCs w:val="18"/>
+              </w:rPr>
+            </w:pPr>
+            <w:r>
+              <w:rPr>
+                <w:rFonts w:ascii="Poppins" w:hAnsi="Poppins" w:cs="Poppins"/>
+                <w:noProof/>
+                <w:sz w:val="18"/>
+                <w:szCs w:val="18"/>
+              </w:rPr>
+              <w:t xml:space="preserve">- </w:t>
             </w:r>
             <w:r>
               <w:rPr>
                 <w:rFonts w:ascii="Poppins" w:hAnsi="Poppins" w:cs="Poppins"/>
-                <w:b/>
-                <w:bCs/>
-                <w:noProof/>
-                <w:sz w:val="20"/>
-                <w:szCs w:val="20"/>
-              </w:rPr>
-              <w:t xml:space="preserve"> y Fronted</w:t>
+                <w:noProof/>
+                <w:sz w:val="18"/>
+                <w:szCs w:val="18"/>
+              </w:rPr>
+              <w:t>QA / Tester</w:t>
             </w:r>
           </w:p>
         </w:tc>
@@ -1175,16 +1200,16 @@
               <w:rPr>
                 <w:rFonts w:ascii="Poppins" w:hAnsi="Poppins" w:cs="Poppins"/>
                 <w:noProof/>
-                <w:sz w:val="20"/>
-                <w:szCs w:val="20"/>
+                <w:sz w:val="18"/>
+                <w:szCs w:val="18"/>
               </w:rPr>
             </w:pPr>
             <w:r>
               <w:rPr>
                 <w:rFonts w:ascii="Poppins" w:hAnsi="Poppins" w:cs="Poppins"/>
                 <w:noProof/>
-                <w:sz w:val="20"/>
-                <w:szCs w:val="20"/>
+                <w:sz w:val="18"/>
+                <w:szCs w:val="18"/>
               </w:rPr>
               <w:t>Caggiano Josefina</w:t>
             </w:r>
@@ -1192,47 +1217,109 @@
         </w:tc>
         <w:tc>
           <w:tcPr>
-            <w:tcW w:w="2831" w:type="dxa"/>
+            <w:tcW w:w="6803" w:type="dxa"/>
           </w:tcPr>
           <w:p>
             <w:pPr>
               <w:rPr>
                 <w:rFonts w:ascii="Poppins" w:hAnsi="Poppins" w:cs="Poppins"/>
                 <w:noProof/>
-                <w:sz w:val="20"/>
-                <w:szCs w:val="20"/>
+                <w:sz w:val="18"/>
+                <w:szCs w:val="18"/>
               </w:rPr>
             </w:pPr>
             <w:r>
               <w:rPr>
                 <w:rFonts w:ascii="Poppins" w:hAnsi="Poppins" w:cs="Poppins"/>
                 <w:noProof/>
-                <w:sz w:val="20"/>
-                <w:szCs w:val="20"/>
+                <w:sz w:val="18"/>
+                <w:szCs w:val="18"/>
+              </w:rPr>
+              <w:t>- Analista de Sistemas</w:t>
+            </w:r>
+          </w:p>
+          <w:p>
+            <w:pPr>
+              <w:rPr>
+                <w:rFonts w:ascii="Poppins" w:hAnsi="Poppins" w:cs="Poppins"/>
+                <w:noProof/>
+                <w:sz w:val="18"/>
+                <w:szCs w:val="18"/>
+              </w:rPr>
+            </w:pPr>
+            <w:r>
+              <w:rPr>
+                <w:rFonts w:ascii="Poppins" w:hAnsi="Poppins" w:cs="Poppins"/>
+                <w:noProof/>
+                <w:sz w:val="18"/>
+                <w:szCs w:val="18"/>
               </w:rPr>
               <w:t xml:space="preserve">- </w:t>
             </w:r>
             <w:r>
               <w:rPr>
                 <w:rFonts w:ascii="Poppins" w:hAnsi="Poppins" w:cs="Poppins"/>
-                <w:b/>
-                <w:bCs/>
-                <w:noProof/>
-                <w:sz w:val="20"/>
-                <w:szCs w:val="20"/>
-              </w:rPr>
-              <w:t>Desarrollador/a Backend</w:t>
+                <w:noProof/>
+                <w:sz w:val="18"/>
+                <w:szCs w:val="18"/>
+              </w:rPr>
+              <w:t>Desarrolladora Backend y Fronted</w:t>
+            </w:r>
+          </w:p>
+          <w:p>
+            <w:pPr>
+              <w:rPr>
+                <w:rFonts w:ascii="Poppins" w:hAnsi="Poppins" w:cs="Poppins"/>
+                <w:noProof/>
+                <w:sz w:val="18"/>
+                <w:szCs w:val="18"/>
+              </w:rPr>
+            </w:pPr>
+            <w:r>
+              <w:rPr>
+                <w:rFonts w:ascii="Poppins" w:hAnsi="Poppins" w:cs="Poppins"/>
+                <w:noProof/>
+                <w:sz w:val="18"/>
+                <w:szCs w:val="18"/>
+              </w:rPr>
+              <w:t xml:space="preserve">- </w:t>
             </w:r>
             <w:r>
               <w:rPr>
                 <w:rFonts w:ascii="Poppins" w:hAnsi="Poppins" w:cs="Poppins"/>
-                <w:b/>
-                <w:bCs/>
-                <w:noProof/>
-                <w:sz w:val="20"/>
-                <w:szCs w:val="20"/>
-              </w:rPr>
-              <w:t xml:space="preserve"> y Fronted</w:t>
+                <w:noProof/>
+                <w:sz w:val="18"/>
+                <w:szCs w:val="18"/>
+              </w:rPr>
+              <w:t>Diseñador/a UX/UI</w:t>
+            </w:r>
+          </w:p>
+          <w:p>
+            <w:pPr>
+              <w:rPr>
+                <w:rFonts w:ascii="Poppins" w:hAnsi="Poppins" w:cs="Poppins"/>
+                <w:noProof/>
+                <w:sz w:val="18"/>
+                <w:szCs w:val="18"/>
+              </w:rPr>
+            </w:pPr>
+            <w:r>
+              <w:rPr>
+                <w:rFonts w:ascii="Poppins" w:hAnsi="Poppins" w:cs="Poppins"/>
+                <w:noProof/>
+                <w:sz w:val="18"/>
+                <w:szCs w:val="18"/>
+              </w:rPr>
+              <w:t xml:space="preserve">- </w:t>
+            </w:r>
+            <w:r>
+              <w:rPr>
+                <w:rFonts w:ascii="Poppins" w:hAnsi="Poppins" w:cs="Poppins"/>
+                <w:noProof/>
+                <w:sz w:val="18"/>
+                <w:szCs w:val="18"/>
+              </w:rPr>
+              <w:t>QA / Tester</w:t>
             </w:r>
           </w:p>
         </w:tc>
@@ -1247,16 +1334,16 @@
               <w:rPr>
                 <w:rFonts w:ascii="Poppins" w:hAnsi="Poppins" w:cs="Poppins"/>
                 <w:noProof/>
-                <w:sz w:val="20"/>
-                <w:szCs w:val="20"/>
+                <w:sz w:val="18"/>
+                <w:szCs w:val="18"/>
               </w:rPr>
             </w:pPr>
             <w:r>
               <w:rPr>
                 <w:rFonts w:ascii="Poppins" w:hAnsi="Poppins" w:cs="Poppins"/>
                 <w:noProof/>
-                <w:sz w:val="20"/>
-                <w:szCs w:val="20"/>
+                <w:sz w:val="18"/>
+                <w:szCs w:val="18"/>
               </w:rPr>
               <w:t>Bossi Trinidad</w:t>
             </w:r>
@@ -1264,23 +1351,23 @@
         </w:tc>
         <w:tc>
           <w:tcPr>
-            <w:tcW w:w="2831" w:type="dxa"/>
+            <w:tcW w:w="6803" w:type="dxa"/>
           </w:tcPr>
           <w:p>
             <w:pPr>
               <w:rPr>
                 <w:rFonts w:ascii="Poppins" w:hAnsi="Poppins" w:cs="Poppins"/>
                 <w:noProof/>
-                <w:sz w:val="20"/>
-                <w:szCs w:val="20"/>
+                <w:sz w:val="18"/>
+                <w:szCs w:val="18"/>
               </w:rPr>
             </w:pPr>
             <w:r>
               <w:rPr>
                 <w:rFonts w:ascii="Poppins" w:hAnsi="Poppins" w:cs="Poppins"/>
                 <w:noProof/>
-                <w:sz w:val="20"/>
-                <w:szCs w:val="20"/>
+                <w:sz w:val="18"/>
+                <w:szCs w:val="18"/>
               </w:rPr>
               <w:t xml:space="preserve">- </w:t>
             </w:r>
@@ -1288,10 +1375,85 @@
               <w:rPr>
                 <w:rFonts w:ascii="Poppins" w:hAnsi="Poppins" w:cs="Poppins"/>
                 <w:noProof/>
-                <w:sz w:val="20"/>
-                <w:szCs w:val="20"/>
-              </w:rPr>
-              <w:t>Analista de Sistemas</w:t>
+                <w:sz w:val="18"/>
+                <w:szCs w:val="18"/>
+              </w:rPr>
+              <w:t>Desarrolladora de Base de Datos</w:t>
+            </w:r>
+          </w:p>
+          <w:p>
+            <w:pPr>
+              <w:rPr>
+                <w:rFonts w:ascii="Poppins" w:hAnsi="Poppins" w:cs="Poppins"/>
+                <w:noProof/>
+                <w:sz w:val="18"/>
+                <w:szCs w:val="18"/>
+              </w:rPr>
+            </w:pPr>
+            <w:r>
+              <w:rPr>
+                <w:rFonts w:ascii="Poppins" w:hAnsi="Poppins" w:cs="Poppins"/>
+                <w:noProof/>
+                <w:sz w:val="18"/>
+                <w:szCs w:val="18"/>
+              </w:rPr>
+              <w:t>- Desarrolladora Backend y Fronted</w:t>
+            </w:r>
+          </w:p>
+          <w:p>
+            <w:pPr>
+              <w:rPr>
+                <w:rFonts w:ascii="Poppins" w:hAnsi="Poppins" w:cs="Poppins"/>
+                <w:noProof/>
+                <w:sz w:val="18"/>
+                <w:szCs w:val="18"/>
+              </w:rPr>
+            </w:pPr>
+            <w:r>
+              <w:rPr>
+                <w:rFonts w:ascii="Poppins" w:hAnsi="Poppins" w:cs="Poppins"/>
+                <w:noProof/>
+                <w:sz w:val="18"/>
+                <w:szCs w:val="18"/>
+              </w:rPr>
+              <w:t xml:space="preserve">- </w:t>
+            </w:r>
+            <w:r>
+              <w:rPr>
+                <w:rFonts w:ascii="Poppins" w:hAnsi="Poppins" w:cs="Poppins"/>
+                <w:noProof/>
+                <w:sz w:val="18"/>
+                <w:szCs w:val="18"/>
+              </w:rPr>
+              <w:t>QA / Tester</w:t>
+            </w:r>
+          </w:p>
+          <w:p>
+            <w:pPr>
+              <w:rPr>
+                <w:rFonts w:ascii="Poppins" w:hAnsi="Poppins" w:cs="Poppins"/>
+                <w:noProof/>
+                <w:sz w:val="18"/>
+                <w:szCs w:val="18"/>
+              </w:rPr>
+            </w:pPr>
+            <w:r>
+              <w:rPr>
+                <w:rFonts w:ascii="Poppins" w:hAnsi="Poppins" w:cs="Poppins"/>
+                <w:noProof/>
+                <w:sz w:val="18"/>
+                <w:szCs w:val="18"/>
+              </w:rPr>
+              <w:t xml:space="preserve">- </w:t>
+            </w:r>
+            <w:r>
+              <w:rPr>
+                <w:rFonts w:ascii="Poppins" w:hAnsi="Poppins" w:cs="Poppins"/>
+                <w:noProof/>
+                <w:sz w:val="18"/>
+                <w:szCs w:val="18"/>
+              </w:rPr>
+              <w:t>Responsable de Sostenibilidad y Aspectos Legales</w:t>
             </w:r>
           </w:p>
         </w:tc>
@@ -1366,7 +1528,6 @@
           <w:sz w:val="20"/>
           <w:szCs w:val="20"/>
         </w:rPr>
-        <w:lastRenderedPageBreak/>
         <w:t>Analista de Sistemas</w:t>
       </w:r>
       <w:r>
@@ -2760,6 +2921,7 @@
   <w:style w:type="character" w:default="1" w:styleId="Fuentedeprrafopredeter">
     <w:name w:val="Default Paragraph Font"/>
     <w:uiPriority w:val="1"/>
+    <w:semiHidden/>
     <w:unhideWhenUsed/>
   </w:style>
   <w:style w:type="table" w:default="1" w:styleId="Tablanormal">
@@ -3388,4 +3550,16 @@
     </a:ext>
   </a:extLst>
 </a:theme>
+</file>
+
+<file path=customXml/item1.xml><?xml version="1.0" encoding="utf-8"?>
+<b:Sources xmlns:b="http://schemas.openxmlformats.org/officeDocument/2006/bibliography" xmlns="http://schemas.openxmlformats.org/officeDocument/2006/bibliography" SelectedStyle="\APASixthEditionOfficeOnline.xsl" StyleName="APA" Version="6"/>
+</file>
+
+<file path=customXml/itemProps1.xml><?xml version="1.0" encoding="utf-8"?>
+<ds:datastoreItem xmlns:ds="http://schemas.openxmlformats.org/officeDocument/2006/customXml" ds:itemID="{CDAE5F6F-95CF-46A3-B33F-09A922DDBECA}">
+  <ds:schemaRefs>
+    <ds:schemaRef ds:uri="http://schemas.openxmlformats.org/officeDocument/2006/bibliography"/>
+  </ds:schemaRefs>
+</ds:datastoreItem>
 </file>
</xml_diff>